<commit_message>
Updated GitAndGitHub File with gitIgnore concept.
</commit_message>
<xml_diff>
--- a/GitAndGitHubLearning/GitNotes.docx
+++ b/GitAndGitHubLearning/GitNotes.docx
@@ -93,12 +93,7 @@
       </w:r>
       <w:r>
         <w:br/>
-      </w:r>
-      <w:r>
-        <w:t>Git = Tool to track code changes</w:t>
-      </w:r>
-      <w:r>
-        <w:t>.</w:t>
+        <w:t>Git = Tool to track code changes.</w:t>
       </w:r>
     </w:p>
     <w:p>
@@ -115,16 +110,7 @@
         <w:t xml:space="preserve">GitHub -&gt; </w:t>
       </w:r>
       <w:r>
-        <w:t>is a cloud-based platform that</w:t>
-      </w:r>
-      <w:r>
-        <w:t xml:space="preserve"> </w:t>
-      </w:r>
-      <w:r>
-        <w:t>provides Git repositories where developers ca</w:t>
-      </w:r>
-      <w:r>
-        <w:t xml:space="preserve">n store, manage </w:t>
+        <w:t xml:space="preserve">is a cloud-based platform that provides Git repositories where developers can store, manage </w:t>
       </w:r>
       <w:r>
         <w:t>source code</w:t>
@@ -134,8 +120,6 @@
       </w:r>
       <w:r>
         <w:br/>
-      </w:r>
-      <w:r>
         <w:t>GitHub = Online platform to store and share Git repositories</w:t>
       </w:r>
       <w:r>
@@ -356,17 +340,25 @@
         </w:rPr>
         <w:t xml:space="preserve">Set global username and email -&gt; </w:t>
       </w:r>
-      <w:r>
-        <w:rPr>
-          <w:lang w:val="en-US"/>
-        </w:rPr>
-        <w:t xml:space="preserve">git </w:t>
-      </w:r>
       <w:proofErr w:type="spellStart"/>
       <w:r>
         <w:rPr>
           <w:lang w:val="en-US"/>
         </w:rPr>
+        <w:t>git</w:t>
+      </w:r>
+      <w:proofErr w:type="spellEnd"/>
+      <w:r>
+        <w:rPr>
+          <w:lang w:val="en-US"/>
+        </w:rPr>
+        <w:t xml:space="preserve"> </w:t>
+      </w:r>
+      <w:proofErr w:type="spellStart"/>
+      <w:r>
+        <w:rPr>
+          <w:lang w:val="en-US"/>
+        </w:rPr>
         <w:t>config</w:t>
       </w:r>
       <w:proofErr w:type="spellEnd"/>
@@ -407,8 +399,16 @@
         <w:rPr>
           <w:lang w:val="en-US"/>
         </w:rPr>
-        <w:t xml:space="preserve"> git</w:t>
-      </w:r>
+        <w:t xml:space="preserve"> </w:t>
+      </w:r>
+      <w:proofErr w:type="spellStart"/>
+      <w:r>
+        <w:rPr>
+          <w:lang w:val="en-US"/>
+        </w:rPr>
+        <w:t>git</w:t>
+      </w:r>
+      <w:proofErr w:type="spellEnd"/>
       <w:proofErr w:type="gramEnd"/>
       <w:r>
         <w:rPr>
@@ -478,17 +478,25 @@
         </w:rPr>
         <w:t xml:space="preserve">Initialize local git repository -&gt; </w:t>
       </w:r>
-      <w:r>
-        <w:rPr>
-          <w:lang w:val="en-US"/>
-        </w:rPr>
-        <w:t xml:space="preserve">git </w:t>
-      </w:r>
       <w:proofErr w:type="spellStart"/>
       <w:r>
         <w:rPr>
           <w:lang w:val="en-US"/>
         </w:rPr>
+        <w:t>git</w:t>
+      </w:r>
+      <w:proofErr w:type="spellEnd"/>
+      <w:r>
+        <w:rPr>
+          <w:lang w:val="en-US"/>
+        </w:rPr>
+        <w:t xml:space="preserve"> </w:t>
+      </w:r>
+      <w:proofErr w:type="spellStart"/>
+      <w:r>
+        <w:rPr>
+          <w:lang w:val="en-US"/>
+        </w:rPr>
         <w:t>init</w:t>
       </w:r>
       <w:proofErr w:type="spellEnd"/>
@@ -504,21 +512,7 @@
           <w:b/>
           <w:lang w:val="en-US"/>
         </w:rPr>
-        <w:t xml:space="preserve">See local branch </w:t>
-      </w:r>
-      <w:r>
-        <w:rPr>
-          <w:b/>
-          <w:lang w:val="en-US"/>
-        </w:rPr>
-        <w:t>changes</w:t>
-      </w:r>
-      <w:r>
-        <w:rPr>
-          <w:b/>
-          <w:lang w:val="en-US"/>
-        </w:rPr>
-        <w:t xml:space="preserve"> -&gt; </w:t>
+        <w:t xml:space="preserve">See local branch changes -&gt; </w:t>
       </w:r>
       <w:r>
         <w:rPr>
@@ -538,33 +532,27 @@
           <w:b/>
           <w:lang w:val="en-US"/>
         </w:rPr>
-        <w:t>Add changes made in local working directory</w:t>
-      </w:r>
-      <w:r>
-        <w:rPr>
-          <w:b/>
-          <w:lang w:val="en-US"/>
-        </w:rPr>
-        <w:t xml:space="preserve"> to staging area</w:t>
-      </w:r>
-      <w:r>
-        <w:rPr>
-          <w:b/>
-          <w:lang w:val="en-US"/>
-        </w:rPr>
-        <w:t xml:space="preserve"> - &gt; </w:t>
-      </w:r>
-      <w:r>
-        <w:rPr>
-          <w:lang w:val="en-US"/>
-        </w:rPr>
-        <w:t>git add “</w:t>
+        <w:t xml:space="preserve">Add changes made in local working directory to staging area - &gt; </w:t>
       </w:r>
       <w:proofErr w:type="spellStart"/>
       <w:r>
         <w:rPr>
           <w:lang w:val="en-US"/>
         </w:rPr>
+        <w:t>git</w:t>
+      </w:r>
+      <w:proofErr w:type="spellEnd"/>
+      <w:r>
+        <w:rPr>
+          <w:lang w:val="en-US"/>
+        </w:rPr>
+        <w:t xml:space="preserve"> add “</w:t>
+      </w:r>
+      <w:proofErr w:type="spellStart"/>
+      <w:r>
+        <w:rPr>
+          <w:lang w:val="en-US"/>
+        </w:rPr>
         <w:t>fileName</w:t>
       </w:r>
       <w:proofErr w:type="spellEnd"/>
@@ -574,11 +562,19 @@
         </w:rPr>
         <w:t xml:space="preserve">” / </w:t>
       </w:r>
-      <w:r>
-        <w:rPr>
-          <w:lang w:val="en-US"/>
-        </w:rPr>
-        <w:t xml:space="preserve">git </w:t>
+      <w:proofErr w:type="spellStart"/>
+      <w:r>
+        <w:rPr>
+          <w:lang w:val="en-US"/>
+        </w:rPr>
+        <w:t>git</w:t>
+      </w:r>
+      <w:proofErr w:type="spellEnd"/>
+      <w:r>
+        <w:rPr>
+          <w:lang w:val="en-US"/>
+        </w:rPr>
+        <w:t xml:space="preserve"> </w:t>
       </w:r>
       <w:proofErr w:type="gramStart"/>
       <w:r>
@@ -612,82 +608,66 @@
           <w:b/>
           <w:lang w:val="en-US"/>
         </w:rPr>
-        <w:t>Commit the changes made</w:t>
-      </w:r>
-      <w:r>
-        <w:rPr>
-          <w:b/>
-          <w:lang w:val="en-US"/>
-        </w:rPr>
+        <w:t xml:space="preserve">Commit the changes made </w:t>
+      </w:r>
+      <w:r>
+        <w:rPr>
+          <w:b/>
+        </w:rPr>
+        <w:t>and saves them t</w:t>
+      </w:r>
+      <w:r>
+        <w:rPr>
+          <w:b/>
+        </w:rPr>
+        <w:t>o the local repository</w:t>
+      </w:r>
+      <w:r>
+        <w:rPr>
+          <w:b/>
+          <w:lang w:val="en-US"/>
+        </w:rPr>
+        <w:t xml:space="preserve">-&gt; </w:t>
+      </w:r>
+      <w:r>
+        <w:rPr>
+          <w:lang w:val="en-US"/>
+        </w:rPr>
+        <w:t xml:space="preserve">git commit –m “any </w:t>
+      </w:r>
+      <w:proofErr w:type="spellStart"/>
+      <w:r>
+        <w:rPr>
+          <w:lang w:val="en-US"/>
+        </w:rPr>
+        <w:t>msg</w:t>
+      </w:r>
+      <w:proofErr w:type="spellEnd"/>
+      <w:r>
+        <w:rPr>
+          <w:lang w:val="en-US"/>
+        </w:rPr>
+        <w:t>”</w:t>
+      </w:r>
+    </w:p>
+    <w:p>
+      <w:r>
+        <w:rPr>
+          <w:b/>
+        </w:rPr>
+        <w:t>Connect Local Folder to GitHub Repository-&gt;</w:t>
+      </w:r>
+      <w:r>
         <w:t xml:space="preserve"> </w:t>
       </w:r>
       <w:r>
         <w:rPr>
-          <w:b/>
-        </w:rPr>
-        <w:t>and saves them t</w:t>
-      </w:r>
-      <w:r>
-        <w:rPr>
-          <w:b/>
-        </w:rPr>
-        <w:t>o the local repository</w:t>
-      </w:r>
-      <w:r>
-        <w:rPr>
-          <w:b/>
-          <w:lang w:val="en-US"/>
-        </w:rPr>
-        <w:t xml:space="preserve">-&gt; </w:t>
-      </w:r>
-      <w:r>
-        <w:rPr>
-          <w:lang w:val="en-US"/>
-        </w:rPr>
-        <w:t xml:space="preserve">git commit –m “any </w:t>
-      </w:r>
-      <w:proofErr w:type="spellStart"/>
-      <w:r>
-        <w:rPr>
-          <w:lang w:val="en-US"/>
-        </w:rPr>
-        <w:t>msg</w:t>
-      </w:r>
-      <w:proofErr w:type="spellEnd"/>
-      <w:r>
-        <w:rPr>
-          <w:lang w:val="en-US"/>
-        </w:rPr>
-        <w:t>”</w:t>
-      </w:r>
-    </w:p>
-    <w:p>
-      <w:r>
-        <w:rPr>
-          <w:b/>
-        </w:rPr>
-        <w:t>Connect Local Folder to GitHub Repository</w:t>
-      </w:r>
-      <w:r>
-        <w:rPr>
-          <w:b/>
-        </w:rPr>
-        <w:t>-&gt;</w:t>
-      </w:r>
-      <w:r>
-        <w:t xml:space="preserve"> </w:t>
-      </w:r>
-      <w:r>
-        <w:rPr>
           <w:rStyle w:val="l"/>
         </w:rPr>
         <w:t>git</w:t>
       </w:r>
       <w:r>
-        <w:t xml:space="preserve"> remote add origin </w:t>
-      </w:r>
-      <w:r>
-        <w:t>“URL”</w:t>
+        <w:t xml:space="preserve"> remote add origin “URL”</w:t>
       </w:r>
       <w:r>
         <w:br/>
@@ -926,21 +906,7 @@
           <w:b/>
           <w:lang w:val="en-US"/>
         </w:rPr>
-        <w:t xml:space="preserve">See </w:t>
-      </w:r>
-      <w:r>
-        <w:rPr>
-          <w:b/>
-          <w:lang w:val="en-US"/>
-        </w:rPr>
-        <w:t xml:space="preserve">all </w:t>
-      </w:r>
-      <w:r>
-        <w:rPr>
-          <w:b/>
-          <w:lang w:val="en-US"/>
-        </w:rPr>
-        <w:t xml:space="preserve">local </w:t>
+        <w:t xml:space="preserve">See all local </w:t>
       </w:r>
       <w:r>
         <w:rPr>
@@ -983,11 +949,19 @@
         </w:rPr>
         <w:t xml:space="preserve">Create a local branch -&gt; </w:t>
       </w:r>
-      <w:r>
-        <w:rPr>
-          <w:lang w:val="en-US"/>
-        </w:rPr>
-        <w:t xml:space="preserve">git branch </w:t>
+      <w:proofErr w:type="spellStart"/>
+      <w:r>
+        <w:rPr>
+          <w:lang w:val="en-US"/>
+        </w:rPr>
+        <w:t>git</w:t>
+      </w:r>
+      <w:proofErr w:type="spellEnd"/>
+      <w:r>
+        <w:rPr>
+          <w:lang w:val="en-US"/>
+        </w:rPr>
+        <w:t xml:space="preserve"> branch </w:t>
       </w:r>
       <w:r>
         <w:rPr>
@@ -1021,13 +995,27 @@
         <w:rPr>
           <w:lang w:val="en-US"/>
         </w:rPr>
-        <w:t xml:space="preserve"> git checkout –b “</w:t>
+        <w:t xml:space="preserve"> </w:t>
       </w:r>
       <w:proofErr w:type="spellStart"/>
       <w:r>
         <w:rPr>
           <w:lang w:val="en-US"/>
         </w:rPr>
+        <w:t>git</w:t>
+      </w:r>
+      <w:proofErr w:type="spellEnd"/>
+      <w:r>
+        <w:rPr>
+          <w:lang w:val="en-US"/>
+        </w:rPr>
+        <w:t xml:space="preserve"> checkout –b “</w:t>
+      </w:r>
+      <w:proofErr w:type="spellStart"/>
+      <w:r>
+        <w:rPr>
+          <w:lang w:val="en-US"/>
+        </w:rPr>
         <w:t>branchName</w:t>
       </w:r>
       <w:proofErr w:type="spellEnd"/>
@@ -1051,17 +1039,25 @@
         </w:rPr>
         <w:t xml:space="preserve">Switch to any local branch - &gt; </w:t>
       </w:r>
-      <w:r>
-        <w:rPr>
-          <w:lang w:val="en-US"/>
-        </w:rPr>
-        <w:t>git checkout “</w:t>
-      </w:r>
       <w:proofErr w:type="spellStart"/>
       <w:r>
         <w:rPr>
           <w:lang w:val="en-US"/>
         </w:rPr>
+        <w:t>git</w:t>
+      </w:r>
+      <w:proofErr w:type="spellEnd"/>
+      <w:r>
+        <w:rPr>
+          <w:lang w:val="en-US"/>
+        </w:rPr>
+        <w:t xml:space="preserve"> checkout “</w:t>
+      </w:r>
+      <w:proofErr w:type="spellStart"/>
+      <w:r>
+        <w:rPr>
+          <w:lang w:val="en-US"/>
+        </w:rPr>
         <w:t>branchName</w:t>
       </w:r>
       <w:proofErr w:type="spellEnd"/>
@@ -1085,17 +1081,25 @@
         </w:rPr>
         <w:t xml:space="preserve">Take pull from central repository branch -&gt; </w:t>
       </w:r>
-      <w:r>
-        <w:rPr>
-          <w:lang w:val="en-US"/>
-        </w:rPr>
-        <w:t>git pull origin “</w:t>
-      </w:r>
       <w:proofErr w:type="spellStart"/>
       <w:r>
         <w:rPr>
           <w:lang w:val="en-US"/>
         </w:rPr>
+        <w:t>git</w:t>
+      </w:r>
+      <w:proofErr w:type="spellEnd"/>
+      <w:r>
+        <w:rPr>
+          <w:lang w:val="en-US"/>
+        </w:rPr>
+        <w:t xml:space="preserve"> pull origin “</w:t>
+      </w:r>
+      <w:proofErr w:type="spellStart"/>
+      <w:r>
+        <w:rPr>
+          <w:lang w:val="en-US"/>
+        </w:rPr>
         <w:t>branchName</w:t>
       </w:r>
       <w:proofErr w:type="spellEnd"/>
@@ -1119,17 +1123,25 @@
         </w:rPr>
         <w:t xml:space="preserve">Push the code to central repository - &gt; </w:t>
       </w:r>
-      <w:r>
-        <w:rPr>
-          <w:lang w:val="en-US"/>
-        </w:rPr>
-        <w:t>git push origin “</w:t>
-      </w:r>
       <w:proofErr w:type="spellStart"/>
       <w:r>
         <w:rPr>
           <w:lang w:val="en-US"/>
         </w:rPr>
+        <w:t>git</w:t>
+      </w:r>
+      <w:proofErr w:type="spellEnd"/>
+      <w:r>
+        <w:rPr>
+          <w:lang w:val="en-US"/>
+        </w:rPr>
+        <w:t xml:space="preserve"> push origin “</w:t>
+      </w:r>
+      <w:proofErr w:type="spellStart"/>
+      <w:r>
+        <w:rPr>
+          <w:lang w:val="en-US"/>
+        </w:rPr>
         <w:t>branchName</w:t>
       </w:r>
       <w:proofErr w:type="spellEnd"/>
@@ -1156,7 +1168,14 @@
         <w:rPr>
           <w:rStyle w:val="l"/>
         </w:rPr>
-        <w:t xml:space="preserve"> -&gt; </w:t>
+        <w:t xml:space="preserve"> -&gt; git</w:t>
+      </w:r>
+      <w:r>
+        <w:t xml:space="preserve"> pull origin main -</w:t>
+      </w:r>
+      <w:proofErr w:type="gramStart"/>
+      <w:r>
+        <w:t xml:space="preserve">&gt;  </w:t>
       </w:r>
       <w:r>
         <w:rPr>
@@ -1164,17 +1183,50 @@
         </w:rPr>
         <w:t>git</w:t>
       </w:r>
-      <w:r>
-        <w:t xml:space="preserve"> pull origin main</w:t>
-      </w:r>
-      <w:r>
-        <w:t xml:space="preserve"> -</w:t>
+      <w:proofErr w:type="gramEnd"/>
+      <w:r>
+        <w:t xml:space="preserve"> checkout </w:t>
+      </w:r>
+      <w:r>
+        <w:rPr>
+          <w:rStyle w:val="n"/>
+        </w:rPr>
+        <w:t>-b</w:t>
+      </w:r>
+      <w:r>
+        <w:t xml:space="preserve"> </w:t>
+      </w:r>
+      <w:proofErr w:type="spellStart"/>
+      <w:r>
+        <w:t>ticketName</w:t>
+      </w:r>
+      <w:proofErr w:type="spellEnd"/>
+      <w:r>
+        <w:t xml:space="preserve"> </w:t>
+      </w:r>
+      <w:r>
+        <w:t xml:space="preserve"> </w:t>
+      </w:r>
+      <w:r>
+        <w:t>-&gt;</w:t>
+      </w:r>
+      <w:r>
+        <w:t xml:space="preserve"> </w:t>
+      </w:r>
+      <w:r>
+        <w:t xml:space="preserve">do code -&gt; </w:t>
+      </w:r>
+      <w:r>
+        <w:rPr>
+          <w:rStyle w:val="l"/>
+        </w:rPr>
+        <w:t>git</w:t>
+      </w:r>
+      <w:r>
+        <w:t xml:space="preserve"> add . -&gt; </w:t>
       </w:r>
       <w:proofErr w:type="gramStart"/>
       <w:r>
-        <w:t xml:space="preserve">&gt;  </w:t>
-      </w:r>
-      <w:r>
         <w:rPr>
           <w:rStyle w:val="l"/>
         </w:rPr>
@@ -1182,203 +1234,152 @@
       </w:r>
       <w:proofErr w:type="gramEnd"/>
       <w:r>
-        <w:t xml:space="preserve"> checkout </w:t>
+        <w:t xml:space="preserve"> commit </w:t>
       </w:r>
       <w:r>
         <w:rPr>
           <w:rStyle w:val="n"/>
         </w:rPr>
-        <w:t>-b</w:t>
+        <w:t>-m</w:t>
       </w:r>
       <w:r>
         <w:t xml:space="preserve"> </w:t>
       </w:r>
+      <w:r>
+        <w:rPr>
+          <w:rStyle w:val="k"/>
+        </w:rPr>
+        <w:t xml:space="preserve">"fixed issue" -&gt;  </w:t>
+      </w:r>
+      <w:r>
+        <w:rPr>
+          <w:rStyle w:val="l"/>
+        </w:rPr>
+        <w:t>git</w:t>
+      </w:r>
+      <w:r>
+        <w:t xml:space="preserve"> push </w:t>
+      </w:r>
+      <w:r>
+        <w:rPr>
+          <w:rStyle w:val="n"/>
+        </w:rPr>
+        <w:t>-u</w:t>
+      </w:r>
+      <w:r>
+        <w:t xml:space="preserve"> origin </w:t>
+      </w:r>
       <w:proofErr w:type="spellStart"/>
       <w:r>
         <w:t>ticketName</w:t>
       </w:r>
       <w:proofErr w:type="spellEnd"/>
       <w:r>
+        <w:t xml:space="preserve"> -&gt;  PR review  </w:t>
+      </w:r>
+      <w:r>
+        <w:t xml:space="preserve">-&gt; </w:t>
+      </w:r>
+      <w:r>
+        <w:t>merge to main</w:t>
+      </w:r>
+    </w:p>
+    <w:p>
+      <w:pPr>
+        <w:rPr>
+          <w:lang w:val="en-US"/>
+        </w:rPr>
+      </w:pPr>
+      <w:r>
+        <w:rPr>
+          <w:b/>
+          <w:lang w:val="en-US"/>
+        </w:rPr>
+        <w:t xml:space="preserve">See entire commit history -&gt; </w:t>
+      </w:r>
+      <w:r>
+        <w:rPr>
+          <w:lang w:val="en-US"/>
+        </w:rPr>
+        <w:t>git log</w:t>
+      </w:r>
+    </w:p>
+    <w:p>
+      <w:pPr>
+        <w:rPr>
+          <w:lang w:val="en-US"/>
+        </w:rPr>
+      </w:pPr>
+      <w:r>
+        <w:rPr>
+          <w:b/>
+          <w:lang w:val="en-US"/>
+        </w:rPr>
+        <w:t>Delete a branch -&gt;</w:t>
+      </w:r>
+      <w:r>
+        <w:rPr>
+          <w:b/>
+          <w:lang w:val="en-US"/>
+        </w:rPr>
         <w:t xml:space="preserve"> </w:t>
       </w:r>
-      <w:r>
+      <w:proofErr w:type="spellStart"/>
+      <w:r>
+        <w:rPr>
+          <w:lang w:val="en-US"/>
+        </w:rPr>
+        <w:t>git</w:t>
+      </w:r>
+      <w:proofErr w:type="spellEnd"/>
+      <w:r>
+        <w:rPr>
+          <w:lang w:val="en-US"/>
+        </w:rPr>
+        <w:t xml:space="preserve"> branch –d </w:t>
+      </w:r>
+      <w:proofErr w:type="spellStart"/>
+      <w:r>
+        <w:rPr>
+          <w:lang w:val="en-US"/>
+        </w:rPr>
+        <w:t>branchName</w:t>
+      </w:r>
+      <w:proofErr w:type="spellEnd"/>
+    </w:p>
+    <w:p>
+      <w:pPr>
+        <w:rPr>
+          <w:lang w:val="en-US"/>
+        </w:rPr>
+      </w:pPr>
+      <w:r>
+        <w:rPr>
+          <w:b/>
+          <w:lang w:val="en-US"/>
+        </w:rPr>
+        <w:t>Merge two branches -&gt;</w:t>
+      </w:r>
+      <w:r>
+        <w:rPr>
+          <w:b/>
+          <w:lang w:val="en-US"/>
+        </w:rPr>
         <w:t xml:space="preserve"> </w:t>
       </w:r>
-      <w:r>
-        <w:t>-&gt;</w:t>
-      </w:r>
-      <w:r>
-        <w:t xml:space="preserve"> </w:t>
-      </w:r>
-      <w:r>
-        <w:t>do code</w:t>
-      </w:r>
-      <w:r>
-        <w:t xml:space="preserve"> -&gt; </w:t>
-      </w:r>
-      <w:r>
-        <w:rPr>
-          <w:rStyle w:val="l"/>
+      <w:proofErr w:type="spellStart"/>
+      <w:r>
+        <w:rPr>
+          <w:lang w:val="en-US"/>
         </w:rPr>
         <w:t>git</w:t>
       </w:r>
-      <w:r>
-        <w:t xml:space="preserve"> add .</w:t>
-      </w:r>
-      <w:r>
-        <w:t xml:space="preserve"> -&gt; </w:t>
-      </w:r>
-      <w:proofErr w:type="gramStart"/>
-      <w:r>
-        <w:rPr>
-          <w:rStyle w:val="l"/>
-        </w:rPr>
-        <w:t>git</w:t>
-      </w:r>
-      <w:proofErr w:type="gramEnd"/>
-      <w:r>
-        <w:t xml:space="preserve"> commit </w:t>
-      </w:r>
-      <w:r>
-        <w:rPr>
-          <w:rStyle w:val="n"/>
-        </w:rPr>
-        <w:t>-m</w:t>
-      </w:r>
-      <w:r>
-        <w:t xml:space="preserve"> </w:t>
-      </w:r>
-      <w:r>
-        <w:rPr>
-          <w:rStyle w:val="k"/>
-        </w:rPr>
-        <w:t>"fixed issue"</w:t>
-      </w:r>
-      <w:r>
-        <w:rPr>
-          <w:rStyle w:val="k"/>
-        </w:rPr>
-        <w:t xml:space="preserve"> -&gt;  </w:t>
-      </w:r>
-      <w:r>
-        <w:rPr>
-          <w:rStyle w:val="l"/>
-        </w:rPr>
-        <w:t>git</w:t>
-      </w:r>
-      <w:r>
-        <w:t xml:space="preserve"> push </w:t>
-      </w:r>
-      <w:r>
-        <w:rPr>
-          <w:rStyle w:val="n"/>
-        </w:rPr>
-        <w:t>-u</w:t>
-      </w:r>
-      <w:r>
-        <w:t xml:space="preserve"> origin </w:t>
-      </w:r>
-      <w:proofErr w:type="spellStart"/>
-      <w:r>
-        <w:t>ticketName</w:t>
-      </w:r>
       <w:proofErr w:type="spellEnd"/>
       <w:r>
-        <w:t xml:space="preserve"> -&gt;  </w:t>
-      </w:r>
-      <w:r>
-        <w:t>PR review</w:t>
-      </w:r>
-      <w:r>
-        <w:t xml:space="preserve">  </w:t>
-      </w:r>
-      <w:r>
-        <w:t xml:space="preserve">-&gt; </w:t>
-      </w:r>
-      <w:r>
-        <w:t>merge to main</w:t>
-      </w:r>
-    </w:p>
-    <w:p>
-      <w:pPr>
-        <w:rPr>
-          <w:lang w:val="en-US"/>
-        </w:rPr>
-      </w:pPr>
-      <w:r>
-        <w:rPr>
-          <w:b/>
-          <w:lang w:val="en-US"/>
-        </w:rPr>
-        <w:t xml:space="preserve">See entire commit history -&gt; </w:t>
-      </w:r>
-      <w:r>
-        <w:rPr>
-          <w:lang w:val="en-US"/>
-        </w:rPr>
-        <w:t>git log</w:t>
-      </w:r>
-    </w:p>
-    <w:p>
-      <w:pPr>
-        <w:rPr>
-          <w:lang w:val="en-US"/>
-        </w:rPr>
-      </w:pPr>
-      <w:r>
-        <w:rPr>
-          <w:b/>
-          <w:lang w:val="en-US"/>
-        </w:rPr>
-        <w:t>Delete a branch -&gt;</w:t>
-      </w:r>
-      <w:r>
-        <w:rPr>
-          <w:b/>
-          <w:lang w:val="en-US"/>
-        </w:rPr>
-        <w:t xml:space="preserve"> </w:t>
-      </w:r>
-      <w:r>
-        <w:rPr>
-          <w:lang w:val="en-US"/>
-        </w:rPr>
-        <w:t xml:space="preserve">git branch –d </w:t>
-      </w:r>
-      <w:proofErr w:type="spellStart"/>
-      <w:r>
-        <w:rPr>
-          <w:lang w:val="en-US"/>
-        </w:rPr>
-        <w:t>branchName</w:t>
-      </w:r>
-      <w:proofErr w:type="spellEnd"/>
-    </w:p>
-    <w:p>
-      <w:pPr>
-        <w:rPr>
-          <w:lang w:val="en-US"/>
-        </w:rPr>
-      </w:pPr>
-      <w:r>
-        <w:rPr>
-          <w:b/>
-          <w:lang w:val="en-US"/>
-        </w:rPr>
-        <w:t>Merge two branches -&gt;</w:t>
-      </w:r>
-      <w:r>
-        <w:rPr>
-          <w:b/>
-          <w:lang w:val="en-US"/>
-        </w:rPr>
-        <w:t xml:space="preserve"> </w:t>
-      </w:r>
-      <w:r>
-        <w:rPr>
-          <w:lang w:val="en-US"/>
-        </w:rPr>
-        <w:t xml:space="preserve">git merge </w:t>
+        <w:rPr>
+          <w:lang w:val="en-US"/>
+        </w:rPr>
+        <w:t xml:space="preserve"> merge </w:t>
       </w:r>
       <w:proofErr w:type="spellStart"/>
       <w:r>
@@ -1406,19 +1407,7 @@
           <w:iCs w:val="0"/>
           <w:shd w:val="clear" w:color="auto" w:fill="FFFFFF"/>
         </w:rPr>
-        <w:t>U</w:t>
-      </w:r>
-      <w:r>
-        <w:rPr>
-          <w:rStyle w:val="Emphasis"/>
-          <w:rFonts w:cstheme="minorHAnsi"/>
-          <w:b/>
-          <w:bCs/>
-          <w:i w:val="0"/>
-          <w:iCs w:val="0"/>
-          <w:shd w:val="clear" w:color="auto" w:fill="FFFFFF"/>
-        </w:rPr>
-        <w:t>ndo the changes in your working directory</w:t>
+        <w:t>Undo the changes in your working directory</w:t>
       </w:r>
       <w:r>
         <w:rPr>
@@ -1692,8 +1681,6 @@
       <w:r>
         <w:t xml:space="preserve"> </w:t>
       </w:r>
-      <w:bookmarkStart w:id="0" w:name="_GoBack"/>
-      <w:bookmarkEnd w:id="0"/>
       <w:r>
         <w:t xml:space="preserve"> .</w:t>
       </w:r>
@@ -1872,10 +1859,7 @@
         <w:t>git</w:t>
       </w:r>
       <w:r>
-        <w:t xml:space="preserve"> stash</w:t>
-      </w:r>
-      <w:r>
-        <w:t xml:space="preserve"> -&gt;  </w:t>
+        <w:t xml:space="preserve"> stash -&gt;  </w:t>
       </w:r>
       <w:r>
         <w:rPr>
@@ -1884,10 +1868,7 @@
         <w:t>git</w:t>
       </w:r>
       <w:r>
-        <w:t xml:space="preserve"> checkout main</w:t>
-      </w:r>
-      <w:r>
-        <w:t xml:space="preserve">  -&gt;  </w:t>
+        <w:t xml:space="preserve"> checkout main  -&gt;  </w:t>
       </w:r>
       <w:r>
         <w:rPr>
@@ -1896,10 +1877,7 @@
         <w:t>git</w:t>
       </w:r>
       <w:r>
-        <w:t xml:space="preserve"> pull origin main</w:t>
-      </w:r>
-      <w:r>
-        <w:t xml:space="preserve"> -&gt; </w:t>
+        <w:t xml:space="preserve"> pull origin main -&gt; </w:t>
       </w:r>
       <w:r>
         <w:rPr>
@@ -2038,6 +2016,129 @@
           <w:lang w:val="en-US"/>
         </w:rPr>
         <w:t xml:space="preserve"> Useful when you want a clean, linear history, as if all changes were made in a straight line without branches.</w:t>
+      </w:r>
+    </w:p>
+    <w:p>
+      <w:r>
+        <w:rPr>
+          <w:b/>
+        </w:rPr>
+        <w:t xml:space="preserve">What is </w:t>
+      </w:r>
+      <w:r>
+        <w:rPr>
+          <w:rStyle w:val="HTMLCode"/>
+          <w:rFonts w:eastAsiaTheme="minorHAnsi"/>
+          <w:b/>
+        </w:rPr>
+        <w:t>.g</w:t>
+      </w:r>
+      <w:bookmarkStart w:id="0" w:name="_GoBack"/>
+      <w:bookmarkEnd w:id="0"/>
+      <w:r>
+        <w:rPr>
+          <w:rStyle w:val="HTMLCode"/>
+          <w:rFonts w:eastAsiaTheme="minorHAnsi"/>
+          <w:b/>
+        </w:rPr>
+        <w:t>itignore</w:t>
+      </w:r>
+      <w:r>
+        <w:rPr>
+          <w:b/>
+        </w:rPr>
+        <w:t xml:space="preserve"> File?</w:t>
+      </w:r>
+      <w:r>
+        <w:rPr>
+          <w:b/>
+        </w:rPr>
+        <w:t xml:space="preserve"> -&gt; </w:t>
+      </w:r>
+      <w:r>
+        <w:t xml:space="preserve">"Ignore these files/folders. </w:t>
+      </w:r>
+      <w:r>
+        <w:t>Do NOT upload them to GitHub."</w:t>
+      </w:r>
+    </w:p>
+    <w:p>
+      <w:pPr>
+        <w:jc w:val="center"/>
+        <w:rPr>
+          <w:rFonts w:cstheme="minorHAnsi"/>
+          <w:b/>
+          <w:lang w:val="en-US"/>
+        </w:rPr>
+      </w:pPr>
+      <w:proofErr w:type="gramStart"/>
+      <w:r>
+        <w:rPr>
+          <w:rStyle w:val="l"/>
+        </w:rPr>
+        <w:t>git</w:t>
+      </w:r>
+      <w:proofErr w:type="gramEnd"/>
+      <w:r>
+        <w:t xml:space="preserve"> </w:t>
+      </w:r>
+      <w:proofErr w:type="spellStart"/>
+      <w:r>
+        <w:t>init</w:t>
+      </w:r>
+      <w:proofErr w:type="spellEnd"/>
+      <w:r>
+        <w:t xml:space="preserve"> -&gt; C</w:t>
+      </w:r>
+      <w:r>
+        <w:t>reate .gitignore</w:t>
+      </w:r>
+      <w:r>
+        <w:t xml:space="preserve"> file -&gt; </w:t>
+      </w:r>
+      <w:r>
+        <w:rPr>
+          <w:rStyle w:val="l"/>
+        </w:rPr>
+        <w:t>git</w:t>
+      </w:r>
+      <w:r>
+        <w:t xml:space="preserve"> add .</w:t>
+      </w:r>
+      <w:r>
+        <w:t xml:space="preserve">  -&gt; </w:t>
+      </w:r>
+      <w:proofErr w:type="gramStart"/>
+      <w:r>
+        <w:rPr>
+          <w:rStyle w:val="l"/>
+        </w:rPr>
+        <w:t>git</w:t>
+      </w:r>
+      <w:proofErr w:type="gramEnd"/>
+      <w:r>
+        <w:t xml:space="preserve"> commit </w:t>
+      </w:r>
+      <w:r>
+        <w:rPr>
+          <w:rStyle w:val="n"/>
+        </w:rPr>
+        <w:t>-m</w:t>
+      </w:r>
+      <w:r>
+        <w:t xml:space="preserve"> </w:t>
+      </w:r>
+      <w:r>
+        <w:rPr>
+          <w:rStyle w:val="k"/>
+        </w:rPr>
+        <w:t>"Initial commit"</w:t>
+      </w:r>
+      <w:r>
+        <w:rPr>
+          <w:rStyle w:val="k"/>
+        </w:rPr>
+        <w:t>.</w:t>
       </w:r>
     </w:p>
     <w:p>
@@ -2891,7 +2992,7 @@
   <a:extraClrSchemeLst/>
   <a:extLst>
     <a:ext uri="{05A4C25C-085E-4340-85A3-A5531E510DB2}">
-      <thm15:themeFamily xmlns:thm15="http://schemas.microsoft.com/office/thememl/2012/main" xmlns="" name="Office Theme" id="{62F939B6-93AF-4DB8-9C6B-D6C7DFDC589F}" vid="{4A3C46E8-61CC-4603-A589-7422A47A8E4A}"/>
+      <thm15:themeFamily xmlns="" xmlns:thm15="http://schemas.microsoft.com/office/thememl/2012/main" name="Office Theme" id="{62F939B6-93AF-4DB8-9C6B-D6C7DFDC589F}" vid="{4A3C46E8-61CC-4603-A589-7422A47A8E4A}"/>
     </a:ext>
   </a:extLst>
 </a:theme>

</xml_diff>